<commit_message>
v1.1 - Inclusão do Caso de Uso e JSON do Mock
</commit_message>
<xml_diff>
--- a/4604833_Projeto_Qualidade.docx
+++ b/4604833_Projeto_Qualidade.docx
@@ -8806,50 +8806,40 @@
           <w:lang w:eastAsia="pt-BR"/>
         </w:rPr>
       </w:pPr>
-    </w:p>
-    <w:p>
-      <w:pPr>
-        <w:pStyle w:val="Ttulo1"/>
-        <w:rPr>
-          <w:sz w:val="24"/>
-          <w:szCs w:val="24"/>
-        </w:rPr>
-      </w:pPr>
-      <w:bookmarkStart w:id="49" w:name="_Toc233200652"/>
-      <w:r>
-        <w:rPr>
-          <w:sz w:val="24"/>
-          <w:szCs w:val="24"/>
-        </w:rPr>
-        <w:t>5. PLANO DE TESTES E ESTRATÉGIA DE VALIDAÇÃO</w:t>
-      </w:r>
-      <w:bookmarkEnd w:id="49"/>
-    </w:p>
-    <w:p>
-      <w:pPr>
-        <w:pStyle w:val="Ttulo2"/>
-        <w:rPr>
-          <w:sz w:val="24"/>
-          <w:szCs w:val="24"/>
-        </w:rPr>
-      </w:pPr>
-      <w:bookmarkStart w:id="50" w:name="_Toc233200653"/>
-      <w:r>
-        <w:rPr>
-          <w:sz w:val="24"/>
-          <w:szCs w:val="24"/>
-        </w:rPr>
-        <w:t>5.1 Diagrama de Caso de Uso</w:t>
-      </w:r>
-      <w:bookmarkEnd w:id="50"/>
-    </w:p>
-    <w:p>
-      <w:pPr>
+      <w:r>
+        <w:rPr>
+          <w:rFonts w:ascii="Times New Roman" w:eastAsia="Times New Roman" w:hAnsi="Times New Roman" w:cs="Times New Roman"/>
+          <w:b/>
+          <w:bCs/>
+          <w:kern w:val="36"/>
+          <w:sz w:val="24"/>
+          <w:szCs w:val="24"/>
+          <w:lang w:eastAsia="pt-BR"/>
+        </w:rPr>
+        <w:t>4.7 Links Públicos para Autoria de Evidências</w:t>
+      </w:r>
+    </w:p>
+    <w:p>
+      <w:pPr>
+        <w:pStyle w:val="PargrafodaLista"/>
+        <w:numPr>
+          <w:ilvl w:val="0"/>
+          <w:numId w:val="15"/>
+        </w:numPr>
         <w:spacing w:before="100" w:beforeAutospacing="1" w:after="100" w:afterAutospacing="1" w:line="360" w:lineRule="auto"/>
         <w:jc w:val="both"/>
         <w:outlineLvl w:val="0"/>
         <w:rPr>
           <w:rFonts w:ascii="Times New Roman" w:eastAsia="Times New Roman" w:hAnsi="Times New Roman" w:cs="Times New Roman"/>
+          <w:kern w:val="36"/>
+          <w:sz w:val="24"/>
+          <w:szCs w:val="24"/>
+          <w:lang w:eastAsia="pt-BR"/>
+        </w:rPr>
+      </w:pPr>
+      <w:r>
+        <w:rPr>
+          <w:rFonts w:ascii="Times New Roman" w:eastAsia="Times New Roman" w:hAnsi="Times New Roman" w:cs="Times New Roman"/>
           <w:b/>
           <w:bCs/>
           <w:kern w:val="36"/>
@@ -8857,6 +8847,224 @@
           <w:szCs w:val="24"/>
           <w:lang w:eastAsia="pt-BR"/>
         </w:rPr>
+        <w:t>Repositório de QA e Histórico de Versões</w:t>
+      </w:r>
+      <w:r>
+        <w:rPr>
+          <w:rFonts w:ascii="Times New Roman" w:eastAsia="Times New Roman" w:hAnsi="Times New Roman" w:cs="Times New Roman"/>
+          <w:kern w:val="36"/>
+          <w:sz w:val="24"/>
+          <w:szCs w:val="24"/>
+          <w:lang w:eastAsia="pt-BR"/>
+        </w:rPr>
+        <w:t>: [</w:t>
+      </w:r>
+      <w:proofErr w:type="gramStart"/>
+      <w:r>
+        <w:rPr>
+          <w:rFonts w:ascii="Times New Roman" w:eastAsia="Times New Roman" w:hAnsi="Times New Roman" w:cs="Times New Roman"/>
+          <w:kern w:val="36"/>
+          <w:sz w:val="24"/>
+          <w:szCs w:val="24"/>
+          <w:lang w:eastAsia="pt-BR"/>
+        </w:rPr>
+        <w:t>https://github.com/seu-usuario/Raizes-do-Nordeste-QA-Plan](</w:t>
+      </w:r>
+      <w:proofErr w:type="gramEnd"/>
+      <w:r>
+        <w:rPr>
+          <w:rFonts w:ascii="Times New Roman" w:eastAsia="Times New Roman" w:hAnsi="Times New Roman" w:cs="Times New Roman"/>
+          <w:kern w:val="36"/>
+          <w:sz w:val="24"/>
+          <w:szCs w:val="24"/>
+          <w:lang w:eastAsia="pt-BR"/>
+        </w:rPr>
+        <w:t>https://github.com/seu-usuario/Raizes-do-Nordeste-QA-Plan)</w:t>
+      </w:r>
+      <w:r>
+        <w:rPr>
+          <w:rFonts w:ascii="Times New Roman" w:eastAsia="Times New Roman" w:hAnsi="Times New Roman" w:cs="Times New Roman"/>
+          <w:kern w:val="36"/>
+          <w:sz w:val="24"/>
+          <w:szCs w:val="24"/>
+          <w:lang w:eastAsia="pt-BR"/>
+        </w:rPr>
+        <w:t>;</w:t>
+      </w:r>
+    </w:p>
+    <w:p>
+      <w:pPr>
+        <w:pStyle w:val="PargrafodaLista"/>
+        <w:numPr>
+          <w:ilvl w:val="0"/>
+          <w:numId w:val="15"/>
+        </w:numPr>
+        <w:spacing w:before="100" w:beforeAutospacing="1" w:after="100" w:afterAutospacing="1" w:line="360" w:lineRule="auto"/>
+        <w:jc w:val="both"/>
+        <w:outlineLvl w:val="0"/>
+        <w:rPr>
+          <w:rFonts w:ascii="Times New Roman" w:eastAsia="Times New Roman" w:hAnsi="Times New Roman" w:cs="Times New Roman"/>
+          <w:kern w:val="36"/>
+          <w:sz w:val="24"/>
+          <w:szCs w:val="24"/>
+          <w:lang w:eastAsia="pt-BR"/>
+        </w:rPr>
+      </w:pPr>
+      <w:r>
+        <w:rPr>
+          <w:rFonts w:ascii="Times New Roman" w:eastAsia="Times New Roman" w:hAnsi="Times New Roman" w:cs="Times New Roman"/>
+          <w:b/>
+          <w:bCs/>
+          <w:kern w:val="36"/>
+          <w:sz w:val="24"/>
+          <w:szCs w:val="24"/>
+          <w:lang w:eastAsia="pt-BR"/>
+        </w:rPr>
+        <w:t xml:space="preserve">Suíte de Testes e Contrato do </w:t>
+      </w:r>
+      <w:proofErr w:type="spellStart"/>
+      <w:r>
+        <w:rPr>
+          <w:rFonts w:ascii="Times New Roman" w:eastAsia="Times New Roman" w:hAnsi="Times New Roman" w:cs="Times New Roman"/>
+          <w:b/>
+          <w:bCs/>
+          <w:kern w:val="36"/>
+          <w:sz w:val="24"/>
+          <w:szCs w:val="24"/>
+          <w:lang w:eastAsia="pt-BR"/>
+        </w:rPr>
+        <w:t>Mock</w:t>
+      </w:r>
+      <w:proofErr w:type="spellEnd"/>
+      <w:r>
+        <w:rPr>
+          <w:rFonts w:ascii="Times New Roman" w:eastAsia="Times New Roman" w:hAnsi="Times New Roman" w:cs="Times New Roman"/>
+          <w:kern w:val="36"/>
+          <w:sz w:val="24"/>
+          <w:szCs w:val="24"/>
+          <w:lang w:eastAsia="pt-BR"/>
+        </w:rPr>
+        <w:t>: [</w:t>
+      </w:r>
+      <w:proofErr w:type="gramStart"/>
+      <w:r>
+        <w:rPr>
+          <w:rFonts w:ascii="Times New Roman" w:eastAsia="Times New Roman" w:hAnsi="Times New Roman" w:cs="Times New Roman"/>
+          <w:kern w:val="36"/>
+          <w:sz w:val="24"/>
+          <w:szCs w:val="24"/>
+          <w:lang w:eastAsia="pt-BR"/>
+        </w:rPr>
+        <w:t>https://github.com/seu-usuario/Raizes-do-Nordeste-QA-Plan/blob/main/Raizes_Nordeste.postman_collection.json](</w:t>
+      </w:r>
+      <w:proofErr w:type="gramEnd"/>
+      <w:r>
+        <w:rPr>
+          <w:rFonts w:ascii="Times New Roman" w:eastAsia="Times New Roman" w:hAnsi="Times New Roman" w:cs="Times New Roman"/>
+          <w:kern w:val="36"/>
+          <w:sz w:val="24"/>
+          <w:szCs w:val="24"/>
+          <w:lang w:eastAsia="pt-BR"/>
+        </w:rPr>
+        <w:t>https://github.com/seu-usuario/Raizes-do-Nordeste-QA</w:t>
+      </w:r>
+      <w:r>
+        <w:rPr>
+          <w:rFonts w:ascii="Times New Roman" w:eastAsia="Times New Roman" w:hAnsi="Times New Roman" w:cs="Times New Roman"/>
+          <w:kern w:val="36"/>
+          <w:sz w:val="24"/>
+          <w:szCs w:val="24"/>
+          <w:lang w:eastAsia="pt-BR"/>
+        </w:rPr>
+        <w:t>-</w:t>
+      </w:r>
+      <w:r>
+        <w:rPr>
+          <w:rFonts w:ascii="Times New Roman" w:eastAsia="Times New Roman" w:hAnsi="Times New Roman" w:cs="Times New Roman"/>
+          <w:kern w:val="36"/>
+          <w:sz w:val="24"/>
+          <w:szCs w:val="24"/>
+          <w:lang w:eastAsia="pt-BR"/>
+        </w:rPr>
+        <w:t>Plan/blob/main/Raizes_Nordeste.postman_collection.json)</w:t>
+      </w:r>
+      <w:r>
+        <w:rPr>
+          <w:rFonts w:ascii="Times New Roman" w:eastAsia="Times New Roman" w:hAnsi="Times New Roman" w:cs="Times New Roman"/>
+          <w:kern w:val="36"/>
+          <w:sz w:val="24"/>
+          <w:szCs w:val="24"/>
+          <w:lang w:eastAsia="pt-BR"/>
+        </w:rPr>
+        <w:t>.</w:t>
+      </w:r>
+    </w:p>
+    <w:p>
+      <w:pPr>
+        <w:spacing w:before="100" w:beforeAutospacing="1" w:after="100" w:afterAutospacing="1" w:line="360" w:lineRule="auto"/>
+        <w:jc w:val="both"/>
+        <w:outlineLvl w:val="0"/>
+        <w:rPr>
+          <w:rFonts w:ascii="Times New Roman" w:eastAsia="Times New Roman" w:hAnsi="Times New Roman" w:cs="Times New Roman"/>
+          <w:b/>
+          <w:bCs/>
+          <w:kern w:val="36"/>
+          <w:sz w:val="24"/>
+          <w:szCs w:val="24"/>
+          <w:lang w:eastAsia="pt-BR"/>
+        </w:rPr>
+      </w:pPr>
+    </w:p>
+    <w:p>
+      <w:pPr>
+        <w:pStyle w:val="Ttulo1"/>
+        <w:rPr>
+          <w:sz w:val="24"/>
+          <w:szCs w:val="24"/>
+        </w:rPr>
+      </w:pPr>
+      <w:bookmarkStart w:id="49" w:name="_Toc233200652"/>
+      <w:r>
+        <w:rPr>
+          <w:sz w:val="24"/>
+          <w:szCs w:val="24"/>
+        </w:rPr>
+        <w:t>5. PLANO DE TESTES E ESTRATÉGIA DE VALIDAÇÃO</w:t>
+      </w:r>
+      <w:bookmarkEnd w:id="49"/>
+    </w:p>
+    <w:p>
+      <w:pPr>
+        <w:pStyle w:val="Ttulo2"/>
+        <w:rPr>
+          <w:sz w:val="24"/>
+          <w:szCs w:val="24"/>
+        </w:rPr>
+      </w:pPr>
+      <w:bookmarkStart w:id="50" w:name="_Toc233200653"/>
+      <w:r>
+        <w:rPr>
+          <w:sz w:val="24"/>
+          <w:szCs w:val="24"/>
+        </w:rPr>
+        <w:t>5.1 Diagrama de Caso de Uso</w:t>
+      </w:r>
+      <w:bookmarkEnd w:id="50"/>
+    </w:p>
+    <w:p>
+      <w:pPr>
+        <w:spacing w:before="100" w:beforeAutospacing="1" w:after="100" w:afterAutospacing="1" w:line="360" w:lineRule="auto"/>
+        <w:jc w:val="both"/>
+        <w:outlineLvl w:val="0"/>
+        <w:rPr>
+          <w:rFonts w:ascii="Times New Roman" w:eastAsia="Times New Roman" w:hAnsi="Times New Roman" w:cs="Times New Roman"/>
+          <w:b/>
+          <w:bCs/>
+          <w:kern w:val="36"/>
+          <w:sz w:val="24"/>
+          <w:szCs w:val="24"/>
+          <w:lang w:eastAsia="pt-BR"/>
+        </w:rPr>
       </w:pPr>
       <w:bookmarkStart w:id="51" w:name="_Toc230939252"/>
       <w:bookmarkStart w:id="52" w:name="_Toc233200654"/>
@@ -8869,9 +9077,9 @@
         </w:rPr>
         <w:lastRenderedPageBreak/>
         <w:drawing>
-          <wp:inline distT="0" distB="0" distL="0" distR="0" wp14:anchorId="3463799B" wp14:editId="673CF66A">
-            <wp:extent cx="5646375" cy="3000375"/>
-            <wp:effectExtent l="0" t="0" r="0" b="0"/>
+          <wp:inline distT="0" distB="0" distL="0" distR="0" wp14:anchorId="3463799B" wp14:editId="351720FC">
+            <wp:extent cx="5556752" cy="2952750"/>
+            <wp:effectExtent l="0" t="0" r="6350" b="0"/>
             <wp:docPr id="189254212" name="Imagem 2" descr="Diagrama&#10;&#10;Descrição gerada automaticamente"/>
             <wp:cNvGraphicFramePr>
               <a:graphicFrameLocks xmlns:a="http://schemas.openxmlformats.org/drawingml/2006/main" noChangeAspect="1"/>
@@ -8901,7 +9109,7 @@
                   <pic:spPr bwMode="auto">
                     <a:xfrm>
                       <a:off x="0" y="0"/>
-                      <a:ext cx="5651297" cy="3002990"/>
+                      <a:ext cx="5584528" cy="2967509"/>
                     </a:xfrm>
                     <a:prstGeom prst="rect">
                       <a:avLst/>
@@ -8919,21 +9127,6 @@
       </w:r>
       <w:bookmarkEnd w:id="51"/>
       <w:bookmarkEnd w:id="52"/>
-    </w:p>
-    <w:p>
-      <w:pPr>
-        <w:spacing w:before="100" w:beforeAutospacing="1" w:after="100" w:afterAutospacing="1" w:line="360" w:lineRule="auto"/>
-        <w:jc w:val="both"/>
-        <w:outlineLvl w:val="1"/>
-        <w:rPr>
-          <w:rFonts w:ascii="Times New Roman" w:eastAsia="Times New Roman" w:hAnsi="Times New Roman" w:cs="Times New Roman"/>
-          <w:b/>
-          <w:bCs/>
-          <w:sz w:val="24"/>
-          <w:szCs w:val="24"/>
-          <w:lang w:eastAsia="pt-BR"/>
-        </w:rPr>
-      </w:pPr>
     </w:p>
     <w:p>
       <w:pPr>
@@ -16960,7 +17153,7 @@
   <w:abstractNum w:abstractNumId="6" w15:restartNumberingAfterBreak="0">
     <w:nsid w:val="3C0E3293"/>
     <w:multiLevelType w:val="hybridMultilevel"/>
-    <w:tmpl w:val="7EE0EFBC"/>
+    <w:tmpl w:val="ACC44B36"/>
     <w:lvl w:ilvl="0" w:tplc="04160001">
       <w:start w:val="1"/>
       <w:numFmt w:val="bullet"/>
@@ -18774,7 +18967,6 @@
   <w:style w:type="character" w:default="1" w:styleId="Fontepargpadro">
     <w:name w:val="Default Paragraph Font"/>
     <w:uiPriority w:val="1"/>
-    <w:semiHidden/>
     <w:unhideWhenUsed/>
   </w:style>
   <w:style w:type="table" w:default="1" w:styleId="Tabelanormal">

</xml_diff>